<commit_message>
Cyber report: update Section 4 references to UGM Harvard (italic titles, all authors listed, left-aligned)
</commit_message>
<xml_diff>
--- a/04_Cyber_Security_Awareness/04_Contributions/Nah_Section4/Safe Use of Devices.docx
+++ b/04_Cyber_Security_Awareness/04_Contributions/Nah_Section4/Safe Use of Devices.docx
@@ -1107,41 +1107,33 @@
       <w:pPr>
         <w:pStyle w:val="Normal"/>
         <w:spacing w:after="0" w:line="480" w:lineRule="auto"/>
-        <w:ind/>
-        <w:jc w:val="center"/>
-      </w:pPr>
-      <w:r>
-        <w:rPr>
-          <w:rFonts w:ascii="Times New Roman" w:hAnsi="Times New Roman" w:eastAsia="Times New Roman" w:cs="Times New Roman"/>
-          <w:noProof w:val="0"/>
-          <w:color w:val="000000" w:themeColor="text1" w:themeTint="FF" w:themeShade="FF"/>
-          <w:sz w:val="24"/>
-          <w:szCs w:val="24"/>
-          <w:lang w:val="en-US"/>
-        </w:rPr>
-        <w:t xml:space="preserve">Apache Software Foundation. (2021) Apache </w:t>
-      </w:r>
-      <w:r>
-        <w:rPr>
-          <w:rFonts w:ascii="Times New Roman" w:hAnsi="Times New Roman" w:eastAsia="Times New Roman" w:cs="Times New Roman"/>
-          <w:noProof w:val="0"/>
-          <w:color w:val="000000" w:themeColor="text1" w:themeTint="FF" w:themeShade="FF"/>
-          <w:sz w:val="24"/>
-          <w:szCs w:val="24"/>
-          <w:lang w:val="en-US"/>
-        </w:rPr>
-        <w:t>Log4j 2 release notes.</w:t>
-      </w:r>
-      <w:r>
-        <w:rPr>
-          <w:rFonts w:ascii="Times New Roman" w:hAnsi="Times New Roman" w:eastAsia="Times New Roman" w:cs="Times New Roman"/>
-          <w:noProof w:val="0"/>
-          <w:color w:val="000000" w:themeColor="text1" w:themeTint="FF" w:themeShade="FF"/>
-          <w:sz w:val="24"/>
-          <w:szCs w:val="24"/>
-          <w:lang w:val="en-US"/>
-        </w:rPr>
-        <w:t xml:space="preserve"> [Online] Available from: </w:t>
+        <w:ind w:left="720" w:hanging="720"/>
+      </w:pPr>
+      <w:r>
+        <w:rPr>
+          <w:rFonts w:ascii="Times New Roman" w:hAnsi="Times New Roman" w:eastAsia="Times New Roman" w:cs="Times New Roman"/>
+          <w:sz w:val="24"/>
+          <w:szCs w:val="24"/>
+        </w:rPr>
+        <w:t xml:space="preserve">Apache Software Foundation. (2021) </w:t>
+      </w:r>
+      <w:r>
+        <w:rPr>
+          <w:rFonts w:ascii="Times New Roman" w:hAnsi="Times New Roman" w:eastAsia="Times New Roman" w:cs="Times New Roman"/>
+          <w:i w:val="1"/>
+          <w:iCs w:val="1"/>
+          <w:sz w:val="24"/>
+          <w:szCs w:val="24"/>
+        </w:rPr>
+        <w:t xml:space="preserve">Apache Log4j 2 release notes</w:t>
+      </w:r>
+      <w:r>
+        <w:rPr>
+          <w:rFonts w:ascii="Times New Roman" w:hAnsi="Times New Roman" w:eastAsia="Times New Roman" w:cs="Times New Roman"/>
+          <w:sz w:val="24"/>
+          <w:szCs w:val="24"/>
+        </w:rPr>
+        <w:t xml:space="preserve">. [Online] Available from: </w:t>
       </w:r>
       <w:hyperlink r:id="R37d2d61c81ce4f10">
         <w:r>
@@ -1155,68 +1147,58 @@
       <w:r>
         <w:rPr>
           <w:rFonts w:ascii="Times New Roman" w:hAnsi="Times New Roman" w:eastAsia="Times New Roman" w:cs="Times New Roman"/>
+          <w:sz w:val="24"/>
+          <w:szCs w:val="24"/>
+        </w:rPr>
+        <w:t xml:space="preserve">. [Accessed 26 September 2026].</w:t>
+      </w:r>
+    </w:p>
+    <w:p>
+      <w:pPr>
+        <w:pStyle w:val="Normal"/>
+        <w:spacing w:after="0" w:line="480" w:lineRule="auto"/>
+        <w:ind w:left="720" w:hanging="720"/>
+        <w:rPr>
+          <w:rFonts w:ascii="Times New Roman" w:hAnsi="Times New Roman" w:eastAsia="Times New Roman" w:cs="Times New Roman"/>
           <w:noProof w:val="0"/>
           <w:color w:val="000000" w:themeColor="text1" w:themeTint="FF" w:themeShade="FF"/>
           <w:sz w:val="24"/>
           <w:szCs w:val="24"/>
           <w:lang w:val="en-US"/>
         </w:rPr>
-        <w:t xml:space="preserve">. [Accessed 26 September 2026].</w:t>
-      </w:r>
+      </w:pPr>
     </w:p>
     <w:p>
       <w:pPr>
         <w:pStyle w:val="Normal"/>
         <w:spacing w:after="0" w:line="480" w:lineRule="auto"/>
-        <w:ind/>
-        <w:jc w:val="center"/>
-        <w:rPr>
-          <w:rFonts w:ascii="Times New Roman" w:hAnsi="Times New Roman" w:eastAsia="Times New Roman" w:cs="Times New Roman"/>
-          <w:noProof w:val="0"/>
-          <w:color w:val="000000" w:themeColor="text1" w:themeTint="FF" w:themeShade="FF"/>
-          <w:sz w:val="24"/>
-          <w:szCs w:val="24"/>
-          <w:lang w:val="en-US"/>
-        </w:rPr>
-      </w:pPr>
-    </w:p>
-    <w:p>
-      <w:pPr>
-        <w:pStyle w:val="Normal"/>
-        <w:spacing w:after="0" w:line="480" w:lineRule="auto"/>
-        <w:ind/>
-        <w:jc w:val="center"/>
-      </w:pPr>
-      <w:r>
-        <w:rPr>
-          <w:rFonts w:ascii="Times New Roman" w:hAnsi="Times New Roman" w:cs="Times New Roman"/>
-        </w:rPr>
-        <w:t xml:space="preserve">Cybersecurity and Infrastructure Security Agency (CISA). (n.d.) </w:t>
-      </w:r>
-      <w:r>
-        <w:rPr>
-          <w:rFonts w:ascii="Times New Roman" w:hAnsi="Times New Roman" w:cs="Times New Roman"/>
+        <w:ind w:left="720" w:hanging="720"/>
+      </w:pPr>
+      <w:r>
+        <w:rPr>
+          <w:rFonts w:ascii="Times New Roman" w:hAnsi="Times New Roman" w:eastAsia="Times New Roman" w:cs="Times New Roman"/>
+          <w:sz w:val="24"/>
+          <w:szCs w:val="24"/>
+        </w:rPr>
+        <w:t xml:space="preserve">Cybersecurity and Infrastructure Security Agency [CISA]. (n.d.) </w:t>
+      </w:r>
+      <w:r>
+        <w:rPr>
+          <w:rFonts w:ascii="Times New Roman" w:hAnsi="Times New Roman" w:eastAsia="Times New Roman" w:cs="Times New Roman"/>
           <w:i w:val="1"/>
           <w:iCs w:val="1"/>
-        </w:rPr>
-        <w:t>How to protect the data that is stored on your devices</w:t>
-      </w:r>
-      <w:r>
-        <w:rPr>
-          <w:rFonts w:ascii="Times New Roman" w:hAnsi="Times New Roman" w:cs="Times New Roman"/>
-        </w:rPr>
-        <w:t>.</w:t>
-      </w:r>
-      <w:r>
-        <w:rPr>
-          <w:rFonts w:ascii="Times New Roman" w:hAnsi="Times New Roman" w:eastAsia="Times New Roman" w:cs="Times New Roman"/>
-          <w:noProof w:val="0"/>
-          <w:color w:val="000000" w:themeColor="text1" w:themeTint="FF" w:themeShade="FF"/>
-          <w:sz w:val="24"/>
-          <w:szCs w:val="24"/>
-          <w:lang w:val="en-US"/>
-        </w:rPr>
-        <w:t xml:space="preserve"> [Online] Available from: </w:t>
+          <w:sz w:val="24"/>
+          <w:szCs w:val="24"/>
+        </w:rPr>
+        <w:t xml:space="preserve">How to protect the data that is stored on your devices</w:t>
+      </w:r>
+      <w:r>
+        <w:rPr>
+          <w:rFonts w:ascii="Times New Roman" w:hAnsi="Times New Roman" w:eastAsia="Times New Roman" w:cs="Times New Roman"/>
+          <w:sz w:val="24"/>
+          <w:szCs w:val="24"/>
+        </w:rPr>
+        <w:t xml:space="preserve">. [Online] Available from: </w:t>
       </w:r>
       <w:hyperlink r:id="Rba50e42866ee464d">
         <w:r>
@@ -1230,31 +1212,17 @@
       <w:r>
         <w:rPr>
           <w:rFonts w:ascii="Times New Roman" w:hAnsi="Times New Roman" w:eastAsia="Times New Roman" w:cs="Times New Roman"/>
-          <w:noProof w:val="0"/>
-          <w:color w:val="000000" w:themeColor="text1" w:themeTint="FF" w:themeShade="FF"/>
-          <w:sz w:val="24"/>
-          <w:szCs w:val="24"/>
-          <w:lang w:val="en-US"/>
-        </w:rPr>
-        <w:t xml:space="preserve">. </w:t>
-      </w:r>
-      <w:r>
-        <w:rPr>
-          <w:rFonts w:ascii="Times New Roman" w:hAnsi="Times New Roman" w:eastAsia="Times New Roman" w:cs="Times New Roman"/>
-          <w:noProof w:val="0"/>
-          <w:color w:val="000000" w:themeColor="text1" w:themeTint="FF" w:themeShade="FF"/>
-          <w:sz w:val="24"/>
-          <w:szCs w:val="24"/>
-          <w:lang w:val="en-US"/>
-        </w:rPr>
-        <w:t>[Accessed 26 September 2026].</w:t>
+          <w:sz w:val="24"/>
+          <w:szCs w:val="24"/>
+        </w:rPr>
+        <w:t xml:space="preserve">. [Accessed 26 September 2026].</w:t>
       </w:r>
     </w:p>
     <w:p>
       <w:pPr>
         <w:pStyle w:val="Normal"/>
         <w:spacing w:after="0" w:line="480" w:lineRule="auto"/>
-        <w:jc w:val="center"/>
+        <w:ind w:left="720" w:hanging="720"/>
         <w:rPr>
           <w:rFonts w:ascii="Times New Roman" w:hAnsi="Times New Roman" w:cs="Times New Roman"/>
         </w:rPr>
@@ -1264,44 +1232,33 @@
       <w:pPr>
         <w:pStyle w:val="Normal"/>
         <w:spacing w:after="0" w:line="480" w:lineRule="auto"/>
-        <w:jc w:val="center"/>
-      </w:pPr>
-      <w:r>
-        <w:rPr>
-          <w:rFonts w:ascii="Times New Roman" w:hAnsi="Times New Roman" w:cs="Times New Roman"/>
-        </w:rPr>
-        <w:t>Cybersecurity and Infrastructure Security Agency (CISA), Federal Bureau of Investigation (FBI), National Security Agency (NSA), et al. (2021)</w:t>
-      </w:r>
-      <w:r>
-        <w:rPr>
-          <w:rFonts w:ascii="Times New Roman" w:hAnsi="Times New Roman" w:cs="Times New Roman"/>
-        </w:rPr>
-        <w:t xml:space="preserve"> </w:t>
-      </w:r>
-      <w:r>
-        <w:rPr>
-          <w:rFonts w:ascii="Times New Roman" w:hAnsi="Times New Roman" w:cs="Times New Roman"/>
+        <w:ind w:left="720" w:hanging="720"/>
+      </w:pPr>
+      <w:r>
+        <w:rPr>
+          <w:rFonts w:ascii="Times New Roman" w:hAnsi="Times New Roman" w:eastAsia="Times New Roman" w:cs="Times New Roman"/>
+          <w:sz w:val="24"/>
+          <w:szCs w:val="24"/>
+        </w:rPr>
+        <w:t xml:space="preserve">Cybersecurity and Infrastructure Security Agency [CISA], Federal Bureau of Investigation [FBI], National Security Agency [NSA], Australian Cyber Security Centre [ACSC], Canadian Centre for Cyber Security [CCCS], Computer Emergency Response Team New Zealand [CERT NZ], New Zealand National Cyber Security Centre [NZ NCSC] and United Kingdom National Cyber Security Centre [NCSC-UK]. (2021) </w:t>
+      </w:r>
+      <w:r>
+        <w:rPr>
+          <w:rFonts w:ascii="Times New Roman" w:hAnsi="Times New Roman" w:eastAsia="Times New Roman" w:cs="Times New Roman"/>
           <w:i w:val="1"/>
           <w:iCs w:val="1"/>
-        </w:rPr>
-        <w:t>Mitigating Log4Shell and other Log4j-related vulnerabilities</w:t>
-      </w:r>
-      <w:r>
-        <w:rPr>
-          <w:rFonts w:ascii="Times New Roman" w:hAnsi="Times New Roman" w:cs="Times New Roman"/>
-        </w:rPr>
-        <w:t>.</w:t>
-      </w:r>
-      <w:r>
-        <w:rPr>
-          <w:rFonts w:ascii="Times New Roman" w:hAnsi="Times New Roman" w:eastAsia="Times New Roman" w:cs="Times New Roman"/>
-          <w:noProof w:val="0"/>
-          <w:color w:val="000000" w:themeColor="text1" w:themeTint="FF" w:themeShade="FF"/>
-          <w:sz w:val="24"/>
-          <w:szCs w:val="24"/>
-          <w:lang w:val="en-US"/>
-        </w:rPr>
-        <w:t xml:space="preserve"> [Online] Available from: </w:t>
+          <w:sz w:val="24"/>
+          <w:szCs w:val="24"/>
+        </w:rPr>
+        <w:t xml:space="preserve">Mitigating Log4Shell and other Log4j-related vulnerabilities</w:t>
+      </w:r>
+      <w:r>
+        <w:rPr>
+          <w:rFonts w:ascii="Times New Roman" w:hAnsi="Times New Roman" w:eastAsia="Times New Roman" w:cs="Times New Roman"/>
+          <w:sz w:val="24"/>
+          <w:szCs w:val="24"/>
+        </w:rPr>
+        <w:t xml:space="preserve">. [Online] Available from: </w:t>
       </w:r>
       <w:hyperlink r:id="R3aef908b288c4449">
         <w:r>
@@ -1315,144 +1272,57 @@
       <w:r>
         <w:rPr>
           <w:rFonts w:ascii="Times New Roman" w:hAnsi="Times New Roman" w:eastAsia="Times New Roman" w:cs="Times New Roman"/>
+          <w:sz w:val="24"/>
+          <w:szCs w:val="24"/>
+        </w:rPr>
+        <w:t xml:space="preserve">. [Accessed 26 September 2026].</w:t>
+      </w:r>
+    </w:p>
+    <w:p>
+      <w:pPr>
+        <w:pStyle w:val="Normal"/>
+        <w:spacing w:after="0" w:line="480" w:lineRule="auto"/>
+        <w:ind w:left="720" w:hanging="720"/>
+        <w:rPr>
+          <w:rFonts w:ascii="Times New Roman" w:hAnsi="Times New Roman" w:eastAsia="Times New Roman" w:cs="Times New Roman"/>
           <w:noProof w:val="0"/>
           <w:color w:val="000000" w:themeColor="text1" w:themeTint="FF" w:themeShade="FF"/>
           <w:sz w:val="24"/>
           <w:szCs w:val="24"/>
           <w:lang w:val="en-US"/>
         </w:rPr>
-        <w:t xml:space="preserve">. </w:t>
-      </w:r>
-      <w:r>
-        <w:rPr>
-          <w:rFonts w:ascii="Times New Roman" w:hAnsi="Times New Roman" w:eastAsia="Times New Roman" w:cs="Times New Roman"/>
-          <w:noProof w:val="0"/>
-          <w:color w:val="000000" w:themeColor="text1" w:themeTint="FF" w:themeShade="FF"/>
-          <w:sz w:val="24"/>
-          <w:szCs w:val="24"/>
-          <w:lang w:val="en-US"/>
-        </w:rPr>
-        <w:t>[Accessed 26 September 2026].</w:t>
-      </w:r>
-    </w:p>
-    <w:p>
-      <w:pPr>
-        <w:pStyle w:val="Normal"/>
-        <w:spacing w:after="0" w:line="480" w:lineRule="auto"/>
-        <w:jc w:val="center"/>
-        <w:rPr>
-          <w:rFonts w:ascii="Times New Roman" w:hAnsi="Times New Roman" w:eastAsia="Times New Roman" w:cs="Times New Roman"/>
-          <w:noProof w:val="0"/>
-          <w:color w:val="000000" w:themeColor="text1" w:themeTint="FF" w:themeShade="FF"/>
-          <w:sz w:val="24"/>
-          <w:szCs w:val="24"/>
-          <w:lang w:val="en-US"/>
-        </w:rPr>
-      </w:pPr>
-    </w:p>
-    <w:p>
-      <w:pPr>
-        <w:spacing w:after="0" w:line="480" w:lineRule="auto"/>
-        <w:ind/>
-        <w:jc w:val="center"/>
-      </w:pPr>
-      <w:r>
-        <w:rPr>
-          <w:rFonts w:ascii="Times New Roman" w:hAnsi="Times New Roman" w:cs="Times New Roman"/>
-        </w:rPr>
-        <w:t>Draschba</w:t>
-      </w:r>
-      <w:r>
-        <w:rPr>
-          <w:rFonts w:ascii="Times New Roman" w:hAnsi="Times New Roman" w:cs="Times New Roman"/>
-        </w:rPr>
-        <w:t>cher</w:t>
-      </w:r>
-      <w:r>
-        <w:rPr>
-          <w:rFonts w:ascii="Times New Roman" w:hAnsi="Times New Roman" w:cs="Times New Roman"/>
-        </w:rPr>
-        <w:t xml:space="preserve">, F., Maar, L., </w:t>
-      </w:r>
-      <w:r>
-        <w:rPr>
-          <w:rFonts w:ascii="Times New Roman" w:hAnsi="Times New Roman" w:cs="Times New Roman"/>
-        </w:rPr>
-        <w:t>Oberhuber</w:t>
-      </w:r>
-      <w:r>
-        <w:rPr>
-          <w:rFonts w:ascii="Times New Roman" w:hAnsi="Times New Roman" w:cs="Times New Roman"/>
-        </w:rPr>
-        <w:t>, M.</w:t>
-      </w:r>
-      <w:r>
-        <w:rPr>
-          <w:rFonts w:ascii="Times New Roman" w:hAnsi="Times New Roman" w:cs="Times New Roman"/>
-        </w:rPr>
-        <w:t>,</w:t>
-      </w:r>
-      <w:r>
-        <w:rPr>
-          <w:rFonts w:ascii="Times New Roman" w:hAnsi="Times New Roman" w:cs="Times New Roman"/>
-        </w:rPr>
-        <w:t xml:space="preserve"> and </w:t>
-      </w:r>
-      <w:r>
-        <w:rPr>
-          <w:rFonts w:ascii="Times New Roman" w:hAnsi="Times New Roman" w:cs="Times New Roman"/>
-        </w:rPr>
-        <w:t>Mangard</w:t>
-      </w:r>
-      <w:r>
-        <w:rPr>
-          <w:rFonts w:ascii="Times New Roman" w:hAnsi="Times New Roman" w:cs="Times New Roman"/>
-        </w:rPr>
-        <w:t>, S. (2025) ‘</w:t>
-      </w:r>
-      <w:r>
-        <w:rPr>
-          <w:rFonts w:ascii="Times New Roman" w:hAnsi="Times New Roman" w:cs="Times New Roman"/>
-        </w:rPr>
-        <w:t>ChoiceJacking</w:t>
-      </w:r>
-      <w:r>
-        <w:rPr>
-          <w:rFonts w:ascii="Times New Roman" w:hAnsi="Times New Roman" w:cs="Times New Roman"/>
-        </w:rPr>
-        <w:t xml:space="preserve">: Compromising mobile devices through malicious chargers like a decade ago’, </w:t>
-      </w:r>
-      <w:r>
-        <w:rPr>
-          <w:rFonts w:ascii="Times New Roman" w:hAnsi="Times New Roman" w:cs="Times New Roman"/>
+      </w:pPr>
+    </w:p>
+    <w:p>
+      <w:pPr>
+        <w:spacing w:after="0" w:line="480" w:lineRule="auto"/>
+        <w:ind w:left="720" w:hanging="720"/>
+      </w:pPr>
+      <w:r>
+        <w:rPr>
+          <w:rFonts w:ascii="Times New Roman" w:hAnsi="Times New Roman" w:eastAsia="Times New Roman" w:cs="Times New Roman"/>
+          <w:sz w:val="24"/>
+          <w:szCs w:val="24"/>
+        </w:rPr>
+        <w:t xml:space="preserve">Draschbacher, F., Maar, L., Oberhuber, M., and Mangard, S. (2025) ChoiceJacking: compromising mobile devices through malicious chargers like a decade ago. In: </w:t>
+      </w:r>
+      <w:r>
+        <w:rPr>
+          <w:rFonts w:ascii="Times New Roman" w:hAnsi="Times New Roman" w:eastAsia="Times New Roman" w:cs="Times New Roman"/>
           <w:i w:val="1"/>
           <w:iCs w:val="1"/>
-        </w:rPr>
-        <w:t>34th USENIX Security Symposium</w:t>
-      </w:r>
-      <w:r>
-        <w:rPr>
-          <w:rFonts w:ascii="Times New Roman" w:hAnsi="Times New Roman" w:cs="Times New Roman"/>
-        </w:rPr>
-        <w:t xml:space="preserve">, pp. 4363–4379. </w:t>
-      </w:r>
-      <w:r>
-        <w:rPr>
-          <w:rFonts w:ascii="Times New Roman" w:hAnsi="Times New Roman" w:cs="Times New Roman"/>
-        </w:rPr>
-        <w:t xml:space="preserve">[Online] </w:t>
-      </w:r>
-      <w:r>
-        <w:rPr>
-          <w:rFonts w:ascii="Times New Roman" w:hAnsi="Times New Roman" w:cs="Times New Roman"/>
-        </w:rPr>
-        <w:t>Availab</w:t>
-      </w:r>
-      <w:r>
-        <w:rPr>
-          <w:rFonts w:ascii="Times New Roman" w:hAnsi="Times New Roman" w:cs="Times New Roman"/>
-        </w:rPr>
-        <w:t xml:space="preserve">le from: </w:t>
+          <w:sz w:val="24"/>
+          <w:szCs w:val="24"/>
+        </w:rPr>
+        <w:t xml:space="preserve">34th USENIX Security Symposium</w:t>
+      </w:r>
+      <w:r>
+        <w:rPr>
+          <w:rFonts w:ascii="Times New Roman" w:hAnsi="Times New Roman" w:eastAsia="Times New Roman" w:cs="Times New Roman"/>
+          <w:sz w:val="24"/>
+          <w:szCs w:val="24"/>
+        </w:rPr>
+        <w:t xml:space="preserve">. [Online] pp. 4363–4379. Available from: </w:t>
       </w:r>
       <w:hyperlink r:id="R9bc88eaff8c94299">
         <w:r>
@@ -1472,11 +1342,17 @@
       </w:hyperlink>
       <w:r>
         <w:rPr>
-          <w:rFonts w:ascii="Times New Roman" w:hAnsi="Times New Roman" w:cs="Times New Roman"/>
-        </w:rPr>
-        <w:t xml:space="preserve">. </w:t>
-      </w:r>
-      <w:r>
+          <w:rFonts w:ascii="Times New Roman" w:hAnsi="Times New Roman" w:eastAsia="Times New Roman" w:cs="Times New Roman"/>
+          <w:sz w:val="24"/>
+          <w:szCs w:val="24"/>
+        </w:rPr>
+        <w:t xml:space="preserve">. [Accessed 26 September 2026].</w:t>
+      </w:r>
+    </w:p>
+    <w:p>
+      <w:pPr>
+        <w:spacing w:after="0" w:line="480" w:lineRule="auto"/>
+        <w:ind w:left="720" w:hanging="720"/>
         <w:rPr>
           <w:rFonts w:ascii="Times New Roman" w:hAnsi="Times New Roman" w:eastAsia="Times New Roman" w:cs="Times New Roman"/>
           <w:noProof w:val="0"/>
@@ -1485,76 +1361,38 @@
           <w:szCs w:val="24"/>
           <w:lang w:val="en-US"/>
         </w:rPr>
-        <w:t>[Accessed 26 September 2026].</w:t>
-      </w:r>
-    </w:p>
-    <w:p>
-      <w:pPr>
-        <w:spacing w:after="0" w:line="480" w:lineRule="auto"/>
-        <w:jc w:val="center"/>
-        <w:rPr>
-          <w:rFonts w:ascii="Times New Roman" w:hAnsi="Times New Roman" w:eastAsia="Times New Roman" w:cs="Times New Roman"/>
-          <w:noProof w:val="0"/>
-          <w:color w:val="000000" w:themeColor="text1" w:themeTint="FF" w:themeShade="FF"/>
-          <w:sz w:val="24"/>
-          <w:szCs w:val="24"/>
-          <w:lang w:val="en-US"/>
-        </w:rPr>
-      </w:pPr>
-    </w:p>
-    <w:p>
-      <w:pPr>
-        <w:spacing w:after="0" w:line="480" w:lineRule="auto"/>
-        <w:ind/>
-        <w:jc w:val="center"/>
-      </w:pPr>
-      <w:r>
-        <w:rPr>
-          <w:rFonts w:ascii="Times New Roman" w:hAnsi="Times New Roman" w:cs="Times New Roman"/>
-        </w:rPr>
-        <w:t xml:space="preserve">European Union Agency for Cybersecurity (ENISA). (2024) </w:t>
-      </w:r>
-      <w:r>
-        <w:rPr>
-          <w:rFonts w:ascii="Times New Roman" w:hAnsi="Times New Roman" w:cs="Times New Roman"/>
+      </w:pPr>
+    </w:p>
+    <w:p>
+      <w:pPr>
+        <w:spacing w:after="0" w:line="480" w:lineRule="auto"/>
+        <w:ind w:left="720" w:hanging="720"/>
+      </w:pPr>
+      <w:r>
+        <w:rPr>
+          <w:rFonts w:ascii="Times New Roman" w:hAnsi="Times New Roman" w:eastAsia="Times New Roman" w:cs="Times New Roman"/>
+          <w:sz w:val="24"/>
+          <w:szCs w:val="24"/>
+        </w:rPr>
+        <w:t xml:space="preserve">European Union Agency for Cybersecurity [ENISA]. (2024) </w:t>
+      </w:r>
+      <w:r>
+        <w:rPr>
+          <w:rFonts w:ascii="Times New Roman" w:hAnsi="Times New Roman" w:eastAsia="Times New Roman" w:cs="Times New Roman"/>
           <w:i w:val="1"/>
           <w:iCs w:val="1"/>
-        </w:rPr>
-        <w:t xml:space="preserve">Promoting security in the digital world during the European Cybersecurity </w:t>
-      </w:r>
-      <w:r>
-        <w:rPr>
-          <w:rFonts w:ascii="Times New Roman" w:hAnsi="Times New Roman" w:cs="Times New Roman"/>
-          <w:i w:val="1"/>
-          <w:iCs w:val="1"/>
-        </w:rPr>
-        <w:t xml:space="preserve">Month. </w:t>
-      </w:r>
-      <w:r>
-        <w:rPr>
-          <w:rFonts w:ascii="Times New Roman" w:hAnsi="Times New Roman" w:cs="Times New Roman"/>
-          <w:i w:val="0"/>
-          <w:iCs w:val="0"/>
-        </w:rPr>
-        <w:t>[</w:t>
-      </w:r>
-      <w:r>
-        <w:rPr>
-          <w:rFonts w:ascii="Times New Roman" w:hAnsi="Times New Roman" w:cs="Times New Roman"/>
-        </w:rPr>
-        <w:t>Online]</w:t>
-      </w:r>
-      <w:r>
-        <w:rPr>
-          <w:rFonts w:ascii="Times New Roman" w:hAnsi="Times New Roman" w:cs="Times New Roman"/>
-        </w:rPr>
-        <w:t xml:space="preserve"> A</w:t>
-      </w:r>
-      <w:r>
-        <w:rPr>
-          <w:rFonts w:ascii="Times New Roman" w:hAnsi="Times New Roman" w:cs="Times New Roman"/>
-        </w:rPr>
-        <w:t xml:space="preserve">vailable from: </w:t>
+          <w:sz w:val="24"/>
+          <w:szCs w:val="24"/>
+        </w:rPr>
+        <w:t xml:space="preserve">Promoting security in the digital world during the European Cybersecurity Month</w:t>
+      </w:r>
+      <w:r>
+        <w:rPr>
+          <w:rFonts w:ascii="Times New Roman" w:hAnsi="Times New Roman" w:eastAsia="Times New Roman" w:cs="Times New Roman"/>
+          <w:sz w:val="24"/>
+          <w:szCs w:val="24"/>
+        </w:rPr>
+        <w:t xml:space="preserve">. [Online] Available from: </w:t>
       </w:r>
       <w:hyperlink r:id="R41607144affb4359">
         <w:r>
@@ -1567,11 +1405,17 @@
       </w:hyperlink>
       <w:r>
         <w:rPr>
-          <w:rFonts w:ascii="Times New Roman" w:hAnsi="Times New Roman" w:cs="Times New Roman"/>
-        </w:rPr>
-        <w:t xml:space="preserve">. </w:t>
-      </w:r>
-      <w:r>
+          <w:rFonts w:ascii="Times New Roman" w:hAnsi="Times New Roman" w:eastAsia="Times New Roman" w:cs="Times New Roman"/>
+          <w:sz w:val="24"/>
+          <w:szCs w:val="24"/>
+        </w:rPr>
+        <w:t xml:space="preserve">. [Accessed 26 September 2026].</w:t>
+      </w:r>
+    </w:p>
+    <w:p>
+      <w:pPr>
+        <w:spacing w:after="0" w:line="480" w:lineRule="auto"/>
+        <w:ind w:left="720" w:hanging="720"/>
         <w:rPr>
           <w:rFonts w:ascii="Times New Roman" w:hAnsi="Times New Roman" w:eastAsia="Times New Roman" w:cs="Times New Roman"/>
           <w:noProof w:val="0"/>
@@ -1580,21 +1424,6 @@
           <w:szCs w:val="24"/>
           <w:lang w:val="en-US"/>
         </w:rPr>
-        <w:t>[Accessed 26 September 2026].</w:t>
-      </w:r>
-    </w:p>
-    <w:p>
-      <w:pPr>
-        <w:spacing w:after="0" w:line="480" w:lineRule="auto"/>
-        <w:jc w:val="center"/>
-        <w:rPr>
-          <w:rFonts w:ascii="Times New Roman" w:hAnsi="Times New Roman" w:eastAsia="Times New Roman" w:cs="Times New Roman"/>
-          <w:noProof w:val="0"/>
-          <w:color w:val="000000" w:themeColor="text1" w:themeTint="FF" w:themeShade="FF"/>
-          <w:sz w:val="24"/>
-          <w:szCs w:val="24"/>
-          <w:lang w:val="en-US"/>
-        </w:rPr>
       </w:pPr>
     </w:p>
     <w:p>
@@ -1605,91 +1434,29 @@
       </w:pPr>
       <w:r>
         <w:rPr>
-          <w:rFonts w:ascii="Times New Roman" w:hAnsi="Times New Roman" w:cs="Times New Roman"/>
-        </w:rPr>
-        <w:t>Howell</w:t>
-      </w:r>
-      <w:r>
-        <w:rPr>
-          <w:rFonts w:ascii="Times New Roman" w:hAnsi="Times New Roman" w:cs="Times New Roman"/>
-        </w:rPr>
-        <w:t>, G.</w:t>
-      </w:r>
-      <w:r>
-        <w:rPr>
-          <w:rFonts w:ascii="Times New Roman" w:hAnsi="Times New Roman" w:cs="Times New Roman"/>
-        </w:rPr>
-        <w:t>, Franklin, J., Sritapan, V., Souppaya, M.</w:t>
-      </w:r>
-      <w:r>
-        <w:rPr>
-          <w:rFonts w:ascii="Times New Roman" w:hAnsi="Times New Roman" w:cs="Times New Roman"/>
-        </w:rPr>
-        <w:t>,</w:t>
-      </w:r>
-      <w:r>
-        <w:rPr>
-          <w:rFonts w:ascii="Times New Roman" w:hAnsi="Times New Roman" w:cs="Times New Roman"/>
-        </w:rPr>
-        <w:t xml:space="preserve"> and </w:t>
-      </w:r>
-      <w:r>
-        <w:rPr>
-          <w:rFonts w:ascii="Times New Roman" w:hAnsi="Times New Roman" w:cs="Times New Roman"/>
-        </w:rPr>
-        <w:t>Scarfone</w:t>
-      </w:r>
-      <w:r>
-        <w:rPr>
-          <w:rFonts w:ascii="Times New Roman" w:hAnsi="Times New Roman" w:cs="Times New Roman"/>
-        </w:rPr>
-        <w:t>, K. (202</w:t>
-      </w:r>
-      <w:r>
-        <w:rPr>
-          <w:rFonts w:ascii="Times New Roman" w:hAnsi="Times New Roman" w:cs="Times New Roman"/>
-        </w:rPr>
-        <w:t xml:space="preserve">3) </w:t>
-      </w:r>
-      <w:r>
-        <w:rPr>
-          <w:rFonts w:ascii="Times New Roman" w:hAnsi="Times New Roman" w:cs="Times New Roman"/>
+          <w:rFonts w:ascii="Times New Roman" w:hAnsi="Times New Roman" w:eastAsia="Times New Roman" w:cs="Times New Roman"/>
+          <w:sz w:val="24"/>
+          <w:szCs w:val="24"/>
+        </w:rPr>
+        <w:t xml:space="preserve">Howell, G., Franklin, J., Sritapan, V., Souppaya, M., and Scarfone, K. (2023) </w:t>
+      </w:r>
+      <w:r>
+        <w:rPr>
+          <w:rFonts w:ascii="Times New Roman" w:hAnsi="Times New Roman" w:eastAsia="Times New Roman" w:cs="Times New Roman"/>
           <w:i w:val="1"/>
           <w:iCs w:val="1"/>
-        </w:rPr>
-        <w:t>Guidel</w:t>
-      </w:r>
-      <w:r>
-        <w:rPr>
-          <w:rFonts w:ascii="Times New Roman" w:hAnsi="Times New Roman" w:cs="Times New Roman"/>
-          <w:i w:val="1"/>
-          <w:iCs w:val="1"/>
-        </w:rPr>
-        <w:t>ines for managing the security of mobile devices in the enterprise</w:t>
-      </w:r>
-      <w:r>
-        <w:rPr>
-          <w:rFonts w:ascii="Times New Roman" w:hAnsi="Times New Roman" w:cs="Times New Roman"/>
-        </w:rPr>
-        <w:t xml:space="preserve">. NIST Special Publication 800-124 Revision 2. </w:t>
-      </w:r>
-      <w:r>
-        <w:rPr>
-          <w:rFonts w:ascii="Times New Roman" w:hAnsi="Times New Roman" w:cs="Times New Roman"/>
-        </w:rPr>
-        <w:t xml:space="preserve">[Online] </w:t>
-      </w:r>
-      <w:r>
-        <w:rPr>
-          <w:rFonts w:ascii="Times New Roman" w:hAnsi="Times New Roman" w:cs="Times New Roman"/>
-        </w:rPr>
-        <w:t>Available from:</w:t>
-      </w:r>
-      <w:r>
-        <w:rPr>
-          <w:rFonts w:ascii="Times New Roman" w:hAnsi="Times New Roman" w:cs="Times New Roman"/>
-        </w:rPr>
-        <w:t xml:space="preserve"> </w:t>
+          <w:sz w:val="24"/>
+          <w:szCs w:val="24"/>
+        </w:rPr>
+        <w:t xml:space="preserve">Guidelines for managing the security of mobile devices in the enterprise</w:t>
+      </w:r>
+      <w:r>
+        <w:rPr>
+          <w:rFonts w:ascii="Times New Roman" w:hAnsi="Times New Roman" w:eastAsia="Times New Roman" w:cs="Times New Roman"/>
+          <w:sz w:val="24"/>
+          <w:szCs w:val="24"/>
+        </w:rPr>
+        <w:t xml:space="preserve">. NIST Special Publication 800-124 Revision 2. [Online] Available from: </w:t>
       </w:r>
       <w:hyperlink r:id="R38e52baab7c344d0">
         <w:r>
@@ -1702,31 +1469,11 @@
       </w:hyperlink>
       <w:r>
         <w:rPr>
-          <w:rFonts w:ascii="Times New Roman" w:hAnsi="Times New Roman" w:cs="Times New Roman"/>
-        </w:rPr>
-        <w:t xml:space="preserve">. </w:t>
-      </w:r>
-      <w:r>
-        <w:rPr>
-          <w:rFonts w:ascii="Times New Roman" w:hAnsi="Times New Roman" w:eastAsia="Times New Roman" w:cs="Times New Roman"/>
-          <w:noProof w:val="0"/>
-          <w:color w:val="000000" w:themeColor="text1" w:themeTint="FF" w:themeShade="FF"/>
-          <w:sz w:val="24"/>
-          <w:szCs w:val="24"/>
-          <w:lang w:val="en-US"/>
-        </w:rPr>
-        <w:t>[Accessed 26 September 2026</w:t>
-      </w:r>
-      <w:r>
-        <w:rPr>
-          <w:rFonts w:ascii="Times New Roman" w:hAnsi="Times New Roman" w:eastAsia="Times New Roman" w:cs="Times New Roman"/>
-          <w:noProof w:val="0"/>
-          <w:color w:val="000000" w:themeColor="text1" w:themeTint="FF" w:themeShade="FF"/>
-          <w:sz w:val="24"/>
-          <w:szCs w:val="24"/>
-          <w:lang w:val="en-US"/>
-        </w:rPr>
-        <w:t>].</w:t>
+          <w:rFonts w:ascii="Times New Roman" w:hAnsi="Times New Roman" w:eastAsia="Times New Roman" w:cs="Times New Roman"/>
+          <w:sz w:val="24"/>
+          <w:szCs w:val="24"/>
+        </w:rPr>
+        <w:t xml:space="preserve">. [Accessed 26 September 2026].</w:t>
       </w:r>
     </w:p>
     <w:p>
@@ -1755,74 +1502,29 @@
       </w:pPr>
       <w:r>
         <w:rPr>
-          <w:rFonts w:ascii="Times New Roman" w:hAnsi="Times New Roman" w:cs="Times New Roman"/>
-        </w:rPr>
-        <w:t>National Cyber Security Centre (NCSC). (2021</w:t>
-      </w:r>
-      <w:r>
-        <w:rPr>
-          <w:rFonts w:ascii="Times New Roman" w:hAnsi="Times New Roman" w:cs="Times New Roman"/>
-        </w:rPr>
-        <w:t>a</w:t>
-      </w:r>
-      <w:r>
-        <w:rPr>
-          <w:rFonts w:ascii="Times New Roman" w:hAnsi="Times New Roman" w:cs="Times New Roman"/>
-        </w:rPr>
-        <w:t>)</w:t>
-      </w:r>
-      <w:r>
-        <w:rPr>
-          <w:rFonts w:ascii="Times New Roman" w:hAnsi="Times New Roman" w:cs="Times New Roman"/>
-        </w:rPr>
-        <w:t xml:space="preserve"> </w:t>
-      </w:r>
-      <w:r>
-        <w:rPr>
-          <w:rFonts w:ascii="Times New Roman" w:hAnsi="Times New Roman" w:cs="Times New Roman"/>
+          <w:rFonts w:ascii="Times New Roman" w:hAnsi="Times New Roman" w:eastAsia="Times New Roman" w:cs="Times New Roman"/>
+          <w:sz w:val="24"/>
+          <w:szCs w:val="24"/>
+        </w:rPr>
+        <w:t xml:space="preserve">National Cyber Security Centre [NCSC]. (2021a) </w:t>
+      </w:r>
+      <w:r>
+        <w:rPr>
+          <w:rFonts w:ascii="Times New Roman" w:hAnsi="Times New Roman" w:eastAsia="Times New Roman" w:cs="Times New Roman"/>
           <w:i w:val="1"/>
           <w:iCs w:val="1"/>
-        </w:rPr>
-        <w:t>Keeping devices and software up to date</w:t>
-      </w:r>
-      <w:r>
-        <w:rPr>
-          <w:rFonts w:ascii="Times New Roman" w:hAnsi="Times New Roman" w:cs="Times New Roman"/>
-        </w:rPr>
-        <w:t>.</w:t>
-      </w:r>
-      <w:r>
-        <w:rPr>
-          <w:rFonts w:ascii="Times New Roman" w:hAnsi="Times New Roman" w:eastAsia="Times New Roman" w:cs="Times New Roman"/>
-          <w:noProof w:val="0"/>
-          <w:color w:val="000000" w:themeColor="text1" w:themeTint="FF" w:themeShade="FF"/>
-          <w:sz w:val="24"/>
-          <w:szCs w:val="24"/>
-          <w:lang w:val="en-US"/>
-        </w:rPr>
-        <w:t xml:space="preserve"> </w:t>
-      </w:r>
-      <w:r>
-        <w:rPr>
-          <w:rFonts w:ascii="Times New Roman" w:hAnsi="Times New Roman" w:eastAsia="Times New Roman" w:cs="Times New Roman"/>
-          <w:noProof w:val="0"/>
-          <w:color w:val="000000" w:themeColor="text1" w:themeTint="FF" w:themeShade="FF"/>
-          <w:sz w:val="24"/>
-          <w:szCs w:val="24"/>
-          <w:lang w:val="en-US"/>
-        </w:rPr>
-        <w:t>[</w:t>
-      </w:r>
-      <w:r>
-        <w:rPr>
-          <w:rFonts w:ascii="Times New Roman" w:hAnsi="Times New Roman" w:eastAsia="Times New Roman" w:cs="Times New Roman"/>
-          <w:noProof w:val="0"/>
-          <w:color w:val="000000" w:themeColor="text1" w:themeTint="FF" w:themeShade="FF"/>
-          <w:sz w:val="24"/>
-          <w:szCs w:val="24"/>
-          <w:lang w:val="en-US"/>
-        </w:rPr>
-        <w:t xml:space="preserve">Online] Available from: </w:t>
+          <w:sz w:val="24"/>
+          <w:szCs w:val="24"/>
+        </w:rPr>
+        <w:t xml:space="preserve">Keeping devices and software up to date</w:t>
+      </w:r>
+      <w:r>
+        <w:rPr>
+          <w:rFonts w:ascii="Times New Roman" w:hAnsi="Times New Roman" w:eastAsia="Times New Roman" w:cs="Times New Roman"/>
+          <w:sz w:val="24"/>
+          <w:szCs w:val="24"/>
+        </w:rPr>
+        <w:t xml:space="preserve">. [Online] Available from: </w:t>
       </w:r>
       <w:hyperlink r:id="R6426949771434e47">
         <w:r>
@@ -1836,66 +1538,58 @@
       <w:r>
         <w:rPr>
           <w:rFonts w:ascii="Times New Roman" w:hAnsi="Times New Roman" w:eastAsia="Times New Roman" w:cs="Times New Roman"/>
+          <w:sz w:val="24"/>
+          <w:szCs w:val="24"/>
+        </w:rPr>
+        <w:t xml:space="preserve">. [Accessed 26 September 2026].</w:t>
+      </w:r>
+    </w:p>
+    <w:p>
+      <w:pPr>
+        <w:pStyle w:val="Normal"/>
+        <w:spacing w:after="0" w:line="480" w:lineRule="auto"/>
+        <w:ind w:left="720" w:hanging="720"/>
+        <w:rPr>
+          <w:rFonts w:ascii="Times New Roman" w:hAnsi="Times New Roman" w:eastAsia="Times New Roman" w:cs="Times New Roman"/>
           <w:noProof w:val="0"/>
           <w:color w:val="000000" w:themeColor="text1" w:themeTint="FF" w:themeShade="FF"/>
           <w:sz w:val="24"/>
           <w:szCs w:val="24"/>
           <w:lang w:val="en-US"/>
         </w:rPr>
-        <w:t xml:space="preserve">. [Accessed 26 September 2026].</w:t>
-      </w:r>
+      </w:pPr>
     </w:p>
     <w:p>
       <w:pPr>
         <w:pStyle w:val="Normal"/>
         <w:spacing w:after="0" w:line="480" w:lineRule="auto"/>
         <w:ind w:left="720" w:hanging="720"/>
-        <w:rPr>
-          <w:rFonts w:ascii="Times New Roman" w:hAnsi="Times New Roman" w:eastAsia="Times New Roman" w:cs="Times New Roman"/>
-          <w:noProof w:val="0"/>
-          <w:color w:val="000000" w:themeColor="text1" w:themeTint="FF" w:themeShade="FF"/>
-          <w:sz w:val="24"/>
-          <w:szCs w:val="24"/>
-          <w:lang w:val="en-US"/>
-        </w:rPr>
-      </w:pPr>
-    </w:p>
-    <w:p>
-      <w:pPr>
-        <w:pStyle w:val="Normal"/>
-        <w:spacing w:after="0" w:line="480" w:lineRule="auto"/>
-        <w:ind w:left="720" w:hanging="720"/>
-      </w:pPr>
-      <w:r>
-        <w:rPr>
-          <w:rFonts w:ascii="Times New Roman" w:hAnsi="Times New Roman" w:cs="Times New Roman"/>
-        </w:rPr>
-        <w:t xml:space="preserve">National Cyber Security Centre (NCSC). (2021b) </w:t>
-      </w:r>
-      <w:r>
-        <w:rPr>
-          <w:rFonts w:ascii="Times New Roman" w:hAnsi="Times New Roman" w:cs="Times New Roman"/>
+      </w:pPr>
+      <w:r>
+        <w:rPr>
+          <w:rFonts w:ascii="Times New Roman" w:hAnsi="Times New Roman" w:eastAsia="Times New Roman" w:cs="Times New Roman"/>
+          <w:sz w:val="24"/>
+          <w:szCs w:val="24"/>
+        </w:rPr>
+        <w:t xml:space="preserve">National Cyber Security Centre [NCSC]. (2021b) </w:t>
+      </w:r>
+      <w:r>
+        <w:rPr>
+          <w:rFonts w:ascii="Times New Roman" w:hAnsi="Times New Roman" w:eastAsia="Times New Roman" w:cs="Times New Roman"/>
           <w:i w:val="1"/>
           <w:iCs w:val="1"/>
-        </w:rPr>
-        <w:t>Antivirus and other security software</w:t>
-      </w:r>
-      <w:r>
-        <w:rPr>
-          <w:rFonts w:ascii="Times New Roman" w:hAnsi="Times New Roman" w:cs="Times New Roman"/>
-        </w:rPr>
-        <w:t>.</w:t>
-      </w:r>
-      <w:r>
-        <w:rPr>
-          <w:rFonts w:ascii="Times New Roman" w:hAnsi="Times New Roman" w:eastAsia="Times New Roman" w:cs="Times New Roman"/>
-          <w:noProof w:val="0"/>
-          <w:color w:val="000000" w:themeColor="text1" w:themeTint="FF" w:themeShade="FF"/>
-          <w:sz w:val="24"/>
-          <w:szCs w:val="24"/>
-          <w:lang w:val="en-US"/>
-        </w:rPr>
-        <w:t xml:space="preserve"> [Online] Available from: </w:t>
+          <w:sz w:val="24"/>
+          <w:szCs w:val="24"/>
+        </w:rPr>
+        <w:t xml:space="preserve">Antivirus and other security software</w:t>
+      </w:r>
+      <w:r>
+        <w:rPr>
+          <w:rFonts w:ascii="Times New Roman" w:hAnsi="Times New Roman" w:eastAsia="Times New Roman" w:cs="Times New Roman"/>
+          <w:sz w:val="24"/>
+          <w:szCs w:val="24"/>
+        </w:rPr>
+        <w:t xml:space="preserve">. [Online] Available from: </w:t>
       </w:r>
       <w:hyperlink r:id="R7bd0dfc59df7441c">
         <w:r>
@@ -1909,77 +1603,58 @@
       <w:r>
         <w:rPr>
           <w:rFonts w:ascii="Times New Roman" w:hAnsi="Times New Roman" w:eastAsia="Times New Roman" w:cs="Times New Roman"/>
+          <w:sz w:val="24"/>
+          <w:szCs w:val="24"/>
+        </w:rPr>
+        <w:t xml:space="preserve">. [Accessed 26 September 2026].</w:t>
+      </w:r>
+    </w:p>
+    <w:p>
+      <w:pPr>
+        <w:pStyle w:val="Normal"/>
+        <w:spacing w:after="0" w:line="480" w:lineRule="auto"/>
+        <w:ind w:left="720" w:hanging="720"/>
+        <w:rPr>
+          <w:rFonts w:ascii="Times New Roman" w:hAnsi="Times New Roman" w:eastAsia="Times New Roman" w:cs="Times New Roman"/>
           <w:noProof w:val="0"/>
           <w:color w:val="000000" w:themeColor="text1" w:themeTint="FF" w:themeShade="FF"/>
           <w:sz w:val="24"/>
           <w:szCs w:val="24"/>
           <w:lang w:val="en-US"/>
         </w:rPr>
-        <w:t xml:space="preserve">. </w:t>
-      </w:r>
-      <w:r>
-        <w:rPr>
-          <w:rFonts w:ascii="Times New Roman" w:hAnsi="Times New Roman" w:eastAsia="Times New Roman" w:cs="Times New Roman"/>
-          <w:noProof w:val="0"/>
-          <w:color w:val="000000" w:themeColor="text1" w:themeTint="FF" w:themeShade="FF"/>
-          <w:sz w:val="24"/>
-          <w:szCs w:val="24"/>
-          <w:lang w:val="en-US"/>
-        </w:rPr>
-        <w:t>[Accessed 26 September 2026].</w:t>
-      </w:r>
+      </w:pPr>
     </w:p>
     <w:p>
       <w:pPr>
         <w:pStyle w:val="Normal"/>
         <w:spacing w:after="0" w:line="480" w:lineRule="auto"/>
         <w:ind w:left="720" w:hanging="720"/>
-        <w:rPr>
-          <w:rFonts w:ascii="Times New Roman" w:hAnsi="Times New Roman" w:eastAsia="Times New Roman" w:cs="Times New Roman"/>
-          <w:noProof w:val="0"/>
-          <w:color w:val="000000" w:themeColor="text1" w:themeTint="FF" w:themeShade="FF"/>
-          <w:sz w:val="24"/>
-          <w:szCs w:val="24"/>
-          <w:lang w:val="en-US"/>
-        </w:rPr>
-      </w:pPr>
-    </w:p>
-    <w:p>
-      <w:pPr>
-        <w:pStyle w:val="Normal"/>
-        <w:spacing w:after="0" w:line="480" w:lineRule="auto"/>
-        <w:ind w:left="720" w:hanging="720"/>
-      </w:pPr>
-      <w:r>
-        <w:rPr>
-          <w:rFonts w:ascii="Times New Roman" w:hAnsi="Times New Roman" w:cs="Times New Roman"/>
-        </w:rPr>
-        <w:t xml:space="preserve">National Cyber Security Centre (NCSC). (2021c) </w:t>
-      </w:r>
-      <w:r>
-        <w:rPr>
-          <w:rFonts w:ascii="Times New Roman" w:hAnsi="Times New Roman" w:cs="Times New Roman"/>
+      </w:pPr>
+      <w:r>
+        <w:rPr>
+          <w:rFonts w:ascii="Times New Roman" w:hAnsi="Times New Roman" w:eastAsia="Times New Roman" w:cs="Times New Roman"/>
+          <w:sz w:val="24"/>
+          <w:szCs w:val="24"/>
+        </w:rPr>
+        <w:t xml:space="preserve">National Cyber Security Centre [NCSC]. (2021c) </w:t>
+      </w:r>
+      <w:r>
+        <w:rPr>
+          <w:rFonts w:ascii="Times New Roman" w:hAnsi="Times New Roman" w:eastAsia="Times New Roman" w:cs="Times New Roman"/>
           <w:i w:val="1"/>
           <w:iCs w:val="1"/>
-        </w:rPr>
-        <w:t>Using peripherals securely</w:t>
-      </w:r>
-      <w:r>
-        <w:rPr>
-          <w:rFonts w:ascii="Times New Roman" w:hAnsi="Times New Roman" w:cs="Times New Roman"/>
-        </w:rPr>
-        <w:t>.</w:t>
-      </w:r>
-      <w:r>
-        <w:rPr>
-          <w:rFonts w:ascii="Times New Roman" w:hAnsi="Times New Roman" w:eastAsia="Times New Roman" w:cs="Times New Roman"/>
-          <w:noProof w:val="0"/>
-          <w:color w:val="000000" w:themeColor="text1" w:themeTint="FF" w:themeShade="FF"/>
-          <w:sz w:val="24"/>
-          <w:szCs w:val="24"/>
-          <w:lang w:val="en-US"/>
-        </w:rPr>
-        <w:t xml:space="preserve"> [Online] Available from: </w:t>
+          <w:sz w:val="24"/>
+          <w:szCs w:val="24"/>
+        </w:rPr>
+        <w:t xml:space="preserve">Using peripherals securely</w:t>
+      </w:r>
+      <w:r>
+        <w:rPr>
+          <w:rFonts w:ascii="Times New Roman" w:hAnsi="Times New Roman" w:eastAsia="Times New Roman" w:cs="Times New Roman"/>
+          <w:sz w:val="24"/>
+          <w:szCs w:val="24"/>
+        </w:rPr>
+        <w:t xml:space="preserve">. [Online] Available from: </w:t>
       </w:r>
       <w:hyperlink r:id="R8bd3bf222ef44d16">
         <w:r>
@@ -1993,89 +1668,58 @@
       <w:r>
         <w:rPr>
           <w:rFonts w:ascii="Times New Roman" w:hAnsi="Times New Roman" w:eastAsia="Times New Roman" w:cs="Times New Roman"/>
+          <w:sz w:val="24"/>
+          <w:szCs w:val="24"/>
+        </w:rPr>
+        <w:t xml:space="preserve">. [Accessed 26 September 2026].</w:t>
+      </w:r>
+    </w:p>
+    <w:p>
+      <w:pPr>
+        <w:pStyle w:val="Normal"/>
+        <w:spacing w:after="0" w:line="480" w:lineRule="auto"/>
+        <w:ind w:left="720" w:hanging="720"/>
+        <w:rPr>
+          <w:rFonts w:ascii="Times New Roman" w:hAnsi="Times New Roman" w:eastAsia="Times New Roman" w:cs="Times New Roman"/>
           <w:noProof w:val="0"/>
           <w:color w:val="000000" w:themeColor="text1" w:themeTint="FF" w:themeShade="FF"/>
           <w:sz w:val="24"/>
           <w:szCs w:val="24"/>
           <w:lang w:val="en-US"/>
         </w:rPr>
-        <w:t xml:space="preserve">. [Accessed 26 September 2026].</w:t>
-      </w:r>
+      </w:pPr>
     </w:p>
     <w:p>
       <w:pPr>
         <w:pStyle w:val="Normal"/>
         <w:spacing w:after="0" w:line="480" w:lineRule="auto"/>
         <w:ind w:left="720" w:hanging="720"/>
-        <w:rPr>
-          <w:rFonts w:ascii="Times New Roman" w:hAnsi="Times New Roman" w:eastAsia="Times New Roman" w:cs="Times New Roman"/>
-          <w:noProof w:val="0"/>
-          <w:color w:val="000000" w:themeColor="text1" w:themeTint="FF" w:themeShade="FF"/>
-          <w:sz w:val="24"/>
-          <w:szCs w:val="24"/>
-          <w:lang w:val="en-US"/>
-        </w:rPr>
-      </w:pPr>
-    </w:p>
-    <w:p>
-      <w:pPr>
-        <w:pStyle w:val="Normal"/>
-        <w:spacing w:after="0" w:line="480" w:lineRule="auto"/>
-        <w:ind w:left="720" w:hanging="720"/>
-      </w:pPr>
-      <w:r>
-        <w:rPr>
-          <w:rFonts w:ascii="Times New Roman" w:hAnsi="Times New Roman" w:cs="Times New Roman"/>
-        </w:rPr>
-        <w:t xml:space="preserve">National Institute of Standards and Technology (NIST). (2021) </w:t>
-      </w:r>
-      <w:r>
-        <w:rPr>
-          <w:rFonts w:ascii="Times New Roman" w:hAnsi="Times New Roman" w:cs="Times New Roman"/>
+      </w:pPr>
+      <w:r>
+        <w:rPr>
+          <w:rFonts w:ascii="Times New Roman" w:hAnsi="Times New Roman" w:eastAsia="Times New Roman" w:cs="Times New Roman"/>
+          <w:sz w:val="24"/>
+          <w:szCs w:val="24"/>
+        </w:rPr>
+        <w:t xml:space="preserve">National Institute of Standards and Technology [NIST]. (2021) </w:t>
+      </w:r>
+      <w:r>
+        <w:rPr>
+          <w:rFonts w:ascii="Times New Roman" w:hAnsi="Times New Roman" w:eastAsia="Times New Roman" w:cs="Times New Roman"/>
           <w:i w:val="1"/>
           <w:iCs w:val="1"/>
-        </w:rPr>
-        <w:t xml:space="preserve">CVE-2021-44228 detail: Apache Log4j2 JNDI features do not protect against attacker-controlled LDAP and other </w:t>
-      </w:r>
-      <w:r>
-        <w:rPr>
-          <w:rFonts w:ascii="Times New Roman" w:hAnsi="Times New Roman" w:cs="Times New Roman"/>
-          <w:i w:val="1"/>
-          <w:iCs w:val="1"/>
-        </w:rPr>
-        <w:t>JNDI-related</w:t>
-      </w:r>
-      <w:r>
-        <w:rPr>
-          <w:rFonts w:ascii="Times New Roman" w:hAnsi="Times New Roman" w:cs="Times New Roman"/>
-          <w:i w:val="1"/>
-          <w:iCs w:val="1"/>
-        </w:rPr>
-        <w:t xml:space="preserve"> endpoints</w:t>
-      </w:r>
-      <w:r>
-        <w:rPr>
-          <w:rFonts w:ascii="Times New Roman" w:hAnsi="Times New Roman" w:cs="Times New Roman"/>
-        </w:rPr>
-        <w:t>. National Vulnerability Database.</w:t>
-      </w:r>
-      <w:r>
-        <w:rPr>
-          <w:rFonts w:ascii="Times New Roman" w:hAnsi="Times New Roman" w:cs="Times New Roman"/>
-        </w:rPr>
-        <w:t xml:space="preserve"> </w:t>
-      </w:r>
-      <w:r>
-        <w:rPr>
-          <w:rFonts w:ascii="Times New Roman" w:hAnsi="Times New Roman" w:cs="Times New Roman"/>
-        </w:rPr>
-        <w:t xml:space="preserve">[Online] </w:t>
-      </w:r>
-      <w:r>
-        <w:rPr>
-          <w:rFonts w:ascii="Times New Roman" w:hAnsi="Times New Roman" w:cs="Times New Roman"/>
-        </w:rPr>
-        <w:t xml:space="preserve">Available from: </w:t>
+          <w:sz w:val="24"/>
+          <w:szCs w:val="24"/>
+        </w:rPr>
+        <w:t xml:space="preserve">CVE-2021-44228 detail: Apache Log4j2 JNDI features do not protect against attacker-controlled LDAP and other JNDI-related endpoints</w:t>
+      </w:r>
+      <w:r>
+        <w:rPr>
+          <w:rFonts w:ascii="Times New Roman" w:hAnsi="Times New Roman" w:eastAsia="Times New Roman" w:cs="Times New Roman"/>
+          <w:sz w:val="24"/>
+          <w:szCs w:val="24"/>
+        </w:rPr>
+        <w:t xml:space="preserve">. National Vulnerability Database. [Online] Available from: </w:t>
       </w:r>
       <w:hyperlink r:id="R0003914dda8a42cf">
         <w:r>
@@ -2088,11 +1732,18 @@
       </w:hyperlink>
       <w:r>
         <w:rPr>
-          <w:rFonts w:ascii="Times New Roman" w:hAnsi="Times New Roman" w:cs="Times New Roman"/>
-        </w:rPr>
-        <w:t xml:space="preserve">. </w:t>
-      </w:r>
-      <w:r>
+          <w:rFonts w:ascii="Times New Roman" w:hAnsi="Times New Roman" w:eastAsia="Times New Roman" w:cs="Times New Roman"/>
+          <w:sz w:val="24"/>
+          <w:szCs w:val="24"/>
+        </w:rPr>
+        <w:t xml:space="preserve">. [Accessed 26 September 2026].</w:t>
+      </w:r>
+    </w:p>
+    <w:p>
+      <w:pPr>
+        <w:pStyle w:val="Normal"/>
+        <w:spacing w:after="0" w:line="480" w:lineRule="auto"/>
+        <w:ind w:left="720" w:hanging="720"/>
         <w:rPr>
           <w:rFonts w:ascii="Times New Roman" w:hAnsi="Times New Roman" w:eastAsia="Times New Roman" w:cs="Times New Roman"/>
           <w:noProof w:val="0"/>
@@ -2101,114 +1752,38 @@
           <w:szCs w:val="24"/>
           <w:lang w:val="en-US"/>
         </w:rPr>
-        <w:t>[Accessed 26 September 2026].</w:t>
-      </w:r>
-    </w:p>
-    <w:p>
-      <w:pPr>
-        <w:pStyle w:val="Normal"/>
+      </w:pPr>
+    </w:p>
+    <w:p>
+      <w:pPr>
         <w:spacing w:after="0" w:line="480" w:lineRule="auto"/>
         <w:ind w:left="720" w:hanging="720"/>
-        <w:rPr>
-          <w:rFonts w:ascii="Times New Roman" w:hAnsi="Times New Roman" w:eastAsia="Times New Roman" w:cs="Times New Roman"/>
-          <w:noProof w:val="0"/>
-          <w:color w:val="000000" w:themeColor="text1" w:themeTint="FF" w:themeShade="FF"/>
-          <w:sz w:val="24"/>
-          <w:szCs w:val="24"/>
-          <w:lang w:val="en-US"/>
-        </w:rPr>
-      </w:pPr>
-    </w:p>
-    <w:p>
-      <w:pPr>
-        <w:spacing w:after="0" w:line="480" w:lineRule="auto"/>
-        <w:ind w:left="720" w:hanging="720"/>
-      </w:pPr>
-      <w:r>
-        <w:rPr>
-          <w:rFonts w:ascii="Times New Roman" w:hAnsi="Times New Roman" w:cs="Times New Roman"/>
-        </w:rPr>
-        <w:t xml:space="preserve">Ogata, M., Franklin, J., Voas, J., </w:t>
-      </w:r>
-      <w:r>
-        <w:rPr>
-          <w:rFonts w:ascii="Times New Roman" w:hAnsi="Times New Roman" w:cs="Times New Roman"/>
-        </w:rPr>
-        <w:t>Sritapan</w:t>
-      </w:r>
-      <w:r>
-        <w:rPr>
-          <w:rFonts w:ascii="Times New Roman" w:hAnsi="Times New Roman" w:cs="Times New Roman"/>
-        </w:rPr>
-        <w:t>, V.</w:t>
-      </w:r>
-      <w:r>
-        <w:rPr>
-          <w:rFonts w:ascii="Times New Roman" w:hAnsi="Times New Roman" w:cs="Times New Roman"/>
-        </w:rPr>
-        <w:t>,</w:t>
-      </w:r>
-      <w:r>
-        <w:rPr>
-          <w:rFonts w:ascii="Times New Roman" w:hAnsi="Times New Roman" w:cs="Times New Roman"/>
-        </w:rPr>
-        <w:t xml:space="preserve"> and </w:t>
-      </w:r>
-      <w:r>
-        <w:rPr>
-          <w:rFonts w:ascii="Times New Roman" w:hAnsi="Times New Roman" w:cs="Times New Roman"/>
-        </w:rPr>
-        <w:t>Qui</w:t>
-      </w:r>
-      <w:r>
-        <w:rPr>
-          <w:rFonts w:ascii="Times New Roman" w:hAnsi="Times New Roman" w:cs="Times New Roman"/>
-        </w:rPr>
-        <w:t>rolgico</w:t>
-      </w:r>
-      <w:r>
-        <w:rPr>
-          <w:rFonts w:ascii="Times New Roman" w:hAnsi="Times New Roman" w:cs="Times New Roman"/>
-        </w:rPr>
-        <w:t xml:space="preserve">, </w:t>
-      </w:r>
-      <w:r>
-        <w:rPr>
-          <w:rFonts w:ascii="Times New Roman" w:hAnsi="Times New Roman" w:cs="Times New Roman"/>
-        </w:rPr>
-        <w:t xml:space="preserve">S. (2019) </w:t>
-      </w:r>
-      <w:r>
-        <w:rPr>
-          <w:rFonts w:ascii="Times New Roman" w:hAnsi="Times New Roman" w:cs="Times New Roman"/>
+      </w:pPr>
+      <w:r>
+        <w:rPr>
+          <w:rFonts w:ascii="Times New Roman" w:hAnsi="Times New Roman" w:eastAsia="Times New Roman" w:cs="Times New Roman"/>
+          <w:sz w:val="24"/>
+          <w:szCs w:val="24"/>
+        </w:rPr>
+        <w:t xml:space="preserve">Ogata, M., Franklin, J., Voas, J., Sritapan, V., and Quirolgico, S. (2019) </w:t>
+      </w:r>
+      <w:r>
+        <w:rPr>
+          <w:rFonts w:ascii="Times New Roman" w:hAnsi="Times New Roman" w:eastAsia="Times New Roman" w:cs="Times New Roman"/>
           <w:i w:val="1"/>
           <w:iCs w:val="1"/>
-        </w:rPr>
-        <w:t>Vetting the security of mobile applications</w:t>
-      </w:r>
-      <w:r>
-        <w:rPr>
-          <w:rFonts w:ascii="Times New Roman" w:hAnsi="Times New Roman" w:cs="Times New Roman"/>
-        </w:rPr>
-        <w:t>. NIST Special Publication 800-163 Revision 1.</w:t>
-      </w:r>
-      <w:r>
-        <w:rPr>
-          <w:rFonts w:ascii="Times New Roman" w:hAnsi="Times New Roman" w:cs="Times New Roman"/>
-        </w:rPr>
-        <w:t xml:space="preserve"> </w:t>
-      </w:r>
-      <w:r>
-        <w:rPr>
-          <w:rFonts w:ascii="Times New Roman" w:hAnsi="Times New Roman" w:cs="Times New Roman"/>
-        </w:rPr>
-        <w:t xml:space="preserve">[Online] </w:t>
-      </w:r>
-      <w:r>
-        <w:rPr>
-          <w:rFonts w:ascii="Times New Roman" w:hAnsi="Times New Roman" w:cs="Times New Roman"/>
-        </w:rPr>
-        <w:t xml:space="preserve">Available from: </w:t>
+          <w:sz w:val="24"/>
+          <w:szCs w:val="24"/>
+        </w:rPr>
+        <w:t xml:space="preserve">Vetting the security of mobile applications</w:t>
+      </w:r>
+      <w:r>
+        <w:rPr>
+          <w:rFonts w:ascii="Times New Roman" w:hAnsi="Times New Roman" w:eastAsia="Times New Roman" w:cs="Times New Roman"/>
+          <w:sz w:val="24"/>
+          <w:szCs w:val="24"/>
+        </w:rPr>
+        <w:t xml:space="preserve">. NIST Special Publication 800-163 Revision 1. [Online] Available from: </w:t>
       </w:r>
       <w:hyperlink r:id="R2eb7953fabcb47d8">
         <w:r>
@@ -2221,11 +1796,18 @@
       </w:hyperlink>
       <w:r>
         <w:rPr>
-          <w:rFonts w:ascii="Times New Roman" w:hAnsi="Times New Roman" w:cs="Times New Roman"/>
-        </w:rPr>
-        <w:t xml:space="preserve">. </w:t>
-      </w:r>
-      <w:r>
+          <w:rFonts w:ascii="Times New Roman" w:hAnsi="Times New Roman" w:eastAsia="Times New Roman" w:cs="Times New Roman"/>
+          <w:sz w:val="24"/>
+          <w:szCs w:val="24"/>
+        </w:rPr>
+        <w:t xml:space="preserve">. [Accessed 26 September 2026].</w:t>
+      </w:r>
+    </w:p>
+    <w:p>
+      <w:pPr>
+        <w:pStyle w:val="Normal"/>
+        <w:spacing w:after="0" w:line="480" w:lineRule="auto"/>
+        <w:ind w:left="720" w:hanging="720"/>
         <w:rPr>
           <w:rFonts w:ascii="Times New Roman" w:hAnsi="Times New Roman" w:eastAsia="Times New Roman" w:cs="Times New Roman"/>
           <w:noProof w:val="0"/>
@@ -2234,84 +1816,38 @@
           <w:szCs w:val="24"/>
           <w:lang w:val="en-US"/>
         </w:rPr>
-        <w:t>[Accessed 26 September 2026].</w:t>
-      </w:r>
-    </w:p>
-    <w:p>
-      <w:pPr>
-        <w:pStyle w:val="Normal"/>
+      </w:pPr>
+    </w:p>
+    <w:p>
+      <w:pPr>
         <w:spacing w:after="0" w:line="480" w:lineRule="auto"/>
         <w:ind w:left="720" w:hanging="720"/>
-        <w:rPr>
-          <w:rFonts w:ascii="Times New Roman" w:hAnsi="Times New Roman" w:eastAsia="Times New Roman" w:cs="Times New Roman"/>
-          <w:noProof w:val="0"/>
-          <w:color w:val="000000" w:themeColor="text1" w:themeTint="FF" w:themeShade="FF"/>
-          <w:sz w:val="24"/>
-          <w:szCs w:val="24"/>
-          <w:lang w:val="en-US"/>
-        </w:rPr>
-      </w:pPr>
-    </w:p>
-    <w:p>
-      <w:pPr>
-        <w:spacing w:after="0" w:line="480" w:lineRule="auto"/>
-        <w:ind w:left="720" w:hanging="720"/>
-      </w:pPr>
-      <w:r>
-        <w:rPr>
-          <w:rFonts w:ascii="Times New Roman" w:hAnsi="Times New Roman" w:cs="Times New Roman"/>
-        </w:rPr>
-        <w:t>Souppaya</w:t>
-      </w:r>
-      <w:r>
-        <w:rPr>
-          <w:rFonts w:ascii="Times New Roman" w:hAnsi="Times New Roman" w:cs="Times New Roman"/>
-        </w:rPr>
-        <w:t>, M. and Scarfone, K</w:t>
-      </w:r>
-      <w:r>
-        <w:rPr>
-          <w:rFonts w:ascii="Times New Roman" w:hAnsi="Times New Roman" w:cs="Times New Roman"/>
-        </w:rPr>
-        <w:t>. (2022)</w:t>
-      </w:r>
-      <w:r>
-        <w:rPr>
-          <w:rFonts w:ascii="Times New Roman" w:hAnsi="Times New Roman" w:cs="Times New Roman"/>
-        </w:rPr>
-        <w:t/>
-      </w:r>
-      <w:r>
-        <w:rPr>
-          <w:rFonts w:ascii="Times New Roman" w:hAnsi="Times New Roman" w:cs="Times New Roman"/>
-        </w:rPr>
-        <w:t xml:space="preserve"> Guide</w:t>
-      </w:r>
-      <w:r>
-        <w:rPr>
-          <w:rFonts w:ascii="Times New Roman" w:hAnsi="Times New Roman" w:cs="Times New Roman"/>
+      </w:pPr>
+      <w:r>
+        <w:rPr>
+          <w:rFonts w:ascii="Times New Roman" w:hAnsi="Times New Roman" w:eastAsia="Times New Roman" w:cs="Times New Roman"/>
+          <w:sz w:val="24"/>
+          <w:szCs w:val="24"/>
+        </w:rPr>
+        <w:t xml:space="preserve">Souppaya, M. and Scarfone, K. (2022) </w:t>
+      </w:r>
+      <w:r>
+        <w:rPr>
+          <w:rFonts w:ascii="Times New Roman" w:hAnsi="Times New Roman" w:eastAsia="Times New Roman" w:cs="Times New Roman"/>
           <w:i w:val="1"/>
           <w:iCs w:val="1"/>
-        </w:rPr>
-        <w:t xml:space="preserve"> to enterprise patch management planning: Preventive maintenance for technology</w:t>
-      </w:r>
-      <w:r>
-        <w:rPr>
-          <w:rFonts w:ascii="Times New Roman" w:hAnsi="Times New Roman" w:cs="Times New Roman"/>
-        </w:rPr>
-        <w:t>. NIST Special Publication 800-40 Revision 4.</w:t>
-      </w:r>
-      <w:r>
-        <w:rPr>
-          <w:rFonts w:ascii="Times New Roman" w:hAnsi="Times New Roman" w:cs="Times New Roman"/>
-        </w:rPr>
-        <w:t xml:space="preserve"> [Online]</w:t>
-      </w:r>
-      <w:r>
-        <w:rPr>
-          <w:rFonts w:ascii="Times New Roman" w:hAnsi="Times New Roman" w:cs="Times New Roman"/>
-        </w:rPr>
-        <w:t xml:space="preserve"> Available from: </w:t>
+          <w:sz w:val="24"/>
+          <w:szCs w:val="24"/>
+        </w:rPr>
+        <w:t xml:space="preserve">Guide to enterprise patch management planning: Preventive maintenance for technology</w:t>
+      </w:r>
+      <w:r>
+        <w:rPr>
+          <w:rFonts w:ascii="Times New Roman" w:hAnsi="Times New Roman" w:eastAsia="Times New Roman" w:cs="Times New Roman"/>
+          <w:sz w:val="24"/>
+          <w:szCs w:val="24"/>
+        </w:rPr>
+        <w:t xml:space="preserve">. NIST Special Publication 800-40 Revision 4. [Online] Available from: </w:t>
       </w:r>
       <w:hyperlink r:id="R0b6b1388dfac4efc">
         <w:r>
@@ -2325,24 +1861,10 @@
       <w:r>
         <w:rPr>
           <w:rFonts w:ascii="Times New Roman" w:hAnsi="Times New Roman" w:eastAsia="Times New Roman" w:cs="Times New Roman"/>
-          <w:noProof w:val="0"/>
-          <w:color w:val="000000" w:themeColor="text1" w:themeTint="FF" w:themeShade="FF"/>
-          <w:sz w:val="24"/>
-          <w:szCs w:val="24"/>
-          <w:lang w:val="en-US"/>
-        </w:rPr>
-        <w:t xml:space="preserve">. </w:t>
-      </w:r>
-      <w:r>
-        <w:rPr>
-          <w:rFonts w:ascii="Times New Roman" w:hAnsi="Times New Roman" w:eastAsia="Times New Roman" w:cs="Times New Roman"/>
-          <w:noProof w:val="0"/>
-          <w:color w:val="000000" w:themeColor="text1" w:themeTint="FF" w:themeShade="FF"/>
-          <w:sz w:val="24"/>
-          <w:szCs w:val="24"/>
-          <w:lang w:val="en-US"/>
-        </w:rPr>
-        <w:t>[Accessed 26 September 2026].</w:t>
+          <w:sz w:val="24"/>
+          <w:szCs w:val="24"/>
+        </w:rPr>
+        <w:t xml:space="preserve">. [Accessed 26 September 2026].</w:t>
       </w:r>
     </w:p>
     <w:p>

</xml_diff>